<commit_message>
feat(tarifarios): sistema completo de tarifarios generados desde la DB
- generar_tarifarios_db.py: Tarifario General (12 hojas por categoría),
  escalera modal por talla, excepciones automáticas, esquema de colores 2024,
  A4 horizontal, editor drag&drop con miniaturas/marcadores, salida HTML+Word
- generar_tarifario_escuelas_db.py: Tarifario por Escuela (67 hojas con
  índices por nivel, numeración, ventanas de tallas, artículos enlazados)
- generar_tarifario_escuelas_vertical.py: Catálogo Escolar (A4 vertical con
  recuadro de foto, escala uniforme para doble cara)
- generar_guia_tarifario.py: guía de capacitación (3 págs)
- generar_juego_tarifario.py: Reto Tarifario, juego tipo Kahoot con 128
  preguntas generadas de los precios reales
- Cache local para regenerar sin conexión a la tienda

Co-Authored-By: Claude Fable 5 <noreply@anthropic.com>
</commit_message>
<xml_diff>
--- a/Gestor_de_Inventarios/tarifarios/Tarifario_Accesorios_Polo_2026.docx
+++ b/Gestor_de_Inventarios/tarifarios/Tarifario_Accesorios_Polo_2026.docx
@@ -43,7 +43,7 @@
                 <w:color w:val="FFFFFF"/>
                 <w:sz w:val="40"/>
               </w:rPr>
-              <w:t>ACCESORIOS · PLAYERA POLO BLANCA</w:t>
+              <w:t>ACCESORIOS · MALLA · BATA</w:t>
             </w:r>
           </w:p>
         </w:tc>
@@ -68,7 +68,7 @@
                 <w:color w:val="9DC3E6"/>
                 <w:sz w:val="18"/>
               </w:rPr>
-              <w:t>Actualizado: Abril 2026</w:t>
+              <w:t>Actualizado: Julio 2026 · precios del sistema</w:t>
             </w:r>
           </w:p>
         </w:tc>
@@ -77,6 +77,56 @@
     <w:p>
       <w:pPr>
         <w:spacing w:before="0" w:after="120"/>
+      </w:pPr>
+    </w:p>
+    <w:tbl>
+      <w:tblPr>
+        <w:tblW w:type="auto" w:w="0"/>
+        <w:tblLook w:firstColumn="1" w:firstRow="1" w:lastColumn="0" w:lastRow="0" w:noHBand="0" w:noVBand="1" w:val="04A0"/>
+        <w:tblBorders>
+          <w:top w:val="none"/>
+          <w:left w:val="none"/>
+          <w:bottom w:val="none"/>
+          <w:right w:val="none"/>
+          <w:insideH w:val="none"/>
+          <w:insideV w:val="none"/>
+        </w:tblBorders>
+      </w:tblPr>
+      <w:tblGrid>
+        <w:gridCol w:w="15364"/>
+      </w:tblGrid>
+      <w:tr>
+        <w:tc>
+          <w:tcPr>
+            <w:tcW w:type="dxa" w:w="15364"/>
+            <w:shd w:val="clear" w:color="auto" w:fill="B52020"/>
+            <w:tcMar>
+              <w:top w:w="80" w:type="dxa"/>
+              <w:bottom w:w="80" w:type="dxa"/>
+              <w:left w:w="180" w:type="dxa"/>
+              <w:right w:w="180" w:type="dxa"/>
+            </w:tcMar>
+          </w:tcPr>
+          <w:p>
+            <w:pPr>
+              <w:spacing w:before="0" w:after="0"/>
+              <w:jc w:val="left"/>
+            </w:pPr>
+            <w:r>
+              <w:rPr>
+                <w:b/>
+                <w:color w:val="FFFFFF"/>
+                <w:sz w:val="22"/>
+              </w:rPr>
+              <w:t>Excepciones activas</w:t>
+            </w:r>
+          </w:p>
+        </w:tc>
+      </w:tr>
+    </w:tbl>
+    <w:p>
+      <w:pPr>
+        <w:spacing w:before="0" w:after="40"/>
       </w:pPr>
     </w:p>
     <w:tbl>
@@ -129,7 +179,7 @@
               <w:tc>
                 <w:tcPr>
                   <w:tcW w:type="dxa" w:w="7682"/>
-                  <w:shd w:val="clear" w:color="auto" w:fill="2E6FBF"/>
+                  <w:shd w:val="clear" w:color="auto" w:fill="B52020"/>
                   <w:tcMar>
                     <w:top w:w="70" w:type="dxa"/>
                     <w:bottom w:w="70" w:type="dxa"/>
@@ -148,7 +198,7 @@
                       <w:color w:val="FFFFFF"/>
                       <w:sz w:val="20"/>
                     </w:rPr>
-                    <w:t>Accesorios</w:t>
+                    <w:t>Corbata</w:t>
                   </w:r>
                 </w:p>
               </w:tc>
@@ -162,14 +212,15 @@
               <w:tblLook w:firstColumn="1" w:firstRow="1" w:lastColumn="0" w:lastRow="0" w:noHBand="0" w:noVBand="1" w:val="04A0"/>
             </w:tblPr>
             <w:tblGrid>
-              <w:gridCol w:w="3841"/>
-              <w:gridCol w:w="3841"/>
+              <w:gridCol w:w="2561"/>
+              <w:gridCol w:w="2561"/>
+              <w:gridCol w:w="2561"/>
             </w:tblGrid>
             <w:tr>
               <w:tc>
                 <w:tcPr>
-                  <w:tcW w:type="dxa" w:w="3841"/>
-                  <w:shd w:val="clear" w:color="auto" w:fill="D6E8F7"/>
+                  <w:tcW w:type="dxa" w:w="2561"/>
+                  <w:shd w:val="clear" w:color="auto" w:fill="FCE8E8"/>
                   <w:tcMar>
                     <w:top w:w="50" w:type="dxa"/>
                     <w:bottom w:w="50" w:type="dxa"/>
@@ -185,17 +236,17 @@
                   <w:r>
                     <w:rPr>
                       <w:b/>
-                      <w:color w:val="2E6FBF"/>
+                      <w:color w:val="B52020"/>
                       <w:sz w:val="17"/>
                     </w:rPr>
-                    <w:t>Pieza</w:t>
+                    <w:t>Escuela / Producto</w:t>
                   </w:r>
                 </w:p>
               </w:tc>
               <w:tc>
                 <w:tcPr>
-                  <w:tcW w:type="dxa" w:w="3841"/>
-                  <w:shd w:val="clear" w:color="auto" w:fill="D6E8F7"/>
+                  <w:tcW w:type="dxa" w:w="2561"/>
+                  <w:shd w:val="clear" w:color="auto" w:fill="FCE8E8"/>
                   <w:tcMar>
                     <w:top w:w="50" w:type="dxa"/>
                     <w:bottom w:w="50" w:type="dxa"/>
@@ -211,7 +262,33 @@
                   <w:r>
                     <w:rPr>
                       <w:b/>
-                      <w:color w:val="2E6FBF"/>
+                      <w:color w:val="B52020"/>
+                      <w:sz w:val="17"/>
+                    </w:rPr>
+                    <w:t>Tallas</w:t>
+                  </w:r>
+                </w:p>
+              </w:tc>
+              <w:tc>
+                <w:tcPr>
+                  <w:tcW w:type="dxa" w:w="2561"/>
+                  <w:shd w:val="clear" w:color="auto" w:fill="FCE8E8"/>
+                  <w:tcMar>
+                    <w:top w:w="50" w:type="dxa"/>
+                    <w:bottom w:w="50" w:type="dxa"/>
+                    <w:left w:w="100" w:type="dxa"/>
+                    <w:right w:w="100" w:type="dxa"/>
+                  </w:tcMar>
+                </w:tcPr>
+                <w:p>
+                  <w:pPr>
+                    <w:spacing w:before="0" w:after="0"/>
+                    <w:jc w:val="right"/>
+                  </w:pPr>
+                  <w:r>
+                    <w:rPr>
+                      <w:b/>
+                      <w:color w:val="B52020"/>
                       <w:sz w:val="17"/>
                     </w:rPr>
                     <w:t>Precio</w:t>
@@ -222,7 +299,7 @@
             <w:tr>
               <w:tc>
                 <w:tcPr>
-                  <w:tcW w:type="dxa" w:w="3841"/>
+                  <w:tcW w:type="dxa" w:w="2561"/>
                   <w:shd w:val="clear" w:color="auto" w:fill="FFFFFF"/>
                   <w:tcMar>
                     <w:top w:w="48" w:type="dxa"/>
@@ -242,13 +319,13 @@
                       <w:color w:val="1A1A2E"/>
                       <w:sz w:val="18"/>
                     </w:rPr>
-                    <w:t>Calceta Escolar</w:t>
+                    <w:t>Conalep</w:t>
                   </w:r>
                 </w:p>
               </w:tc>
               <w:tc>
                 <w:tcPr>
-                  <w:tcW w:type="dxa" w:w="3841"/>
+                  <w:tcW w:type="dxa" w:w="2561"/>
                   <w:shd w:val="clear" w:color="auto" w:fill="FFFFFF"/>
                   <w:tcMar>
                     <w:top w:w="48" w:type="dxa"/>
@@ -268,95 +345,13 @@
                       <w:color w:val="1E3A6E"/>
                       <w:sz w:val="18"/>
                     </w:rPr>
-                    <w:t>$49</w:t>
-                  </w:r>
-                </w:p>
-              </w:tc>
-            </w:tr>
-            <w:tr>
-              <w:tc>
-                <w:tcPr>
-                  <w:tcW w:type="dxa" w:w="3841"/>
-                  <w:shd w:val="clear" w:color="auto" w:fill="EDF4FC"/>
-                  <w:tcMar>
-                    <w:top w:w="48" w:type="dxa"/>
-                    <w:bottom w:w="48" w:type="dxa"/>
-                    <w:left w:w="100" w:type="dxa"/>
-                    <w:right w:w="100" w:type="dxa"/>
-                  </w:tcMar>
-                </w:tcPr>
-                <w:p>
-                  <w:pPr>
-                    <w:spacing w:before="0" w:after="0"/>
-                    <w:jc w:val="left"/>
-                  </w:pPr>
-                  <w:r>
-                    <w:rPr>
-                      <w:b w:val="0"/>
-                      <w:color w:val="1A1A2E"/>
-                      <w:sz w:val="18"/>
-                    </w:rPr>
-                    <w:t>Guante Escolta</w:t>
+                    <w:t>UNI</w:t>
                   </w:r>
                 </w:p>
               </w:tc>
               <w:tc>
                 <w:tcPr>
-                  <w:tcW w:type="dxa" w:w="3841"/>
-                  <w:shd w:val="clear" w:color="auto" w:fill="EDF4FC"/>
-                  <w:tcMar>
-                    <w:top w:w="48" w:type="dxa"/>
-                    <w:bottom w:w="48" w:type="dxa"/>
-                    <w:left w:w="100" w:type="dxa"/>
-                    <w:right w:w="100" w:type="dxa"/>
-                  </w:tcMar>
-                </w:tcPr>
-                <w:p>
-                  <w:pPr>
-                    <w:spacing w:before="0" w:after="0"/>
-                    <w:jc w:val="right"/>
-                  </w:pPr>
-                  <w:r>
-                    <w:rPr>
-                      <w:b/>
-                      <w:color w:val="1E3A6E"/>
-                      <w:sz w:val="18"/>
-                    </w:rPr>
-                    <w:t>$49</w:t>
-                  </w:r>
-                </w:p>
-              </w:tc>
-            </w:tr>
-            <w:tr>
-              <w:tc>
-                <w:tcPr>
-                  <w:tcW w:type="dxa" w:w="3841"/>
-                  <w:shd w:val="clear" w:color="auto" w:fill="FFFFFF"/>
-                  <w:tcMar>
-                    <w:top w:w="48" w:type="dxa"/>
-                    <w:bottom w:w="48" w:type="dxa"/>
-                    <w:left w:w="100" w:type="dxa"/>
-                    <w:right w:w="100" w:type="dxa"/>
-                  </w:tcMar>
-                </w:tcPr>
-                <w:p>
-                  <w:pPr>
-                    <w:spacing w:before="0" w:after="0"/>
-                    <w:jc w:val="left"/>
-                  </w:pPr>
-                  <w:r>
-                    <w:rPr>
-                      <w:b w:val="0"/>
-                      <w:color w:val="1A1A2E"/>
-                      <w:sz w:val="18"/>
-                    </w:rPr>
-                    <w:t>Corbata</w:t>
-                  </w:r>
-                </w:p>
-              </w:tc>
-              <w:tc>
-                <w:tcPr>
-                  <w:tcW w:type="dxa" w:w="3841"/>
+                  <w:tcW w:type="dxa" w:w="2561"/>
                   <w:shd w:val="clear" w:color="auto" w:fill="FFFFFF"/>
                   <w:tcMar>
                     <w:top w:w="48" w:type="dxa"/>
@@ -376,169 +371,7 @@
                       <w:color w:val="1E3A6E"/>
                       <w:sz w:val="18"/>
                     </w:rPr>
-                    <w:t>$70</w:t>
-                  </w:r>
-                </w:p>
-              </w:tc>
-            </w:tr>
-            <w:tr>
-              <w:tc>
-                <w:tcPr>
-                  <w:tcW w:type="dxa" w:w="3841"/>
-                  <w:shd w:val="clear" w:color="auto" w:fill="EDF4FC"/>
-                  <w:tcMar>
-                    <w:top w:w="48" w:type="dxa"/>
-                    <w:bottom w:w="48" w:type="dxa"/>
-                    <w:left w:w="100" w:type="dxa"/>
-                    <w:right w:w="100" w:type="dxa"/>
-                  </w:tcMar>
-                </w:tcPr>
-                <w:p>
-                  <w:pPr>
-                    <w:spacing w:before="0" w:after="0"/>
-                    <w:jc w:val="left"/>
-                  </w:pPr>
-                  <w:r>
-                    <w:rPr>
-                      <w:b w:val="0"/>
-                      <w:color w:val="1A1A2E"/>
-                      <w:sz w:val="18"/>
-                    </w:rPr>
-                    <w:t>Corbatín</w:t>
-                  </w:r>
-                </w:p>
-              </w:tc>
-              <w:tc>
-                <w:tcPr>
-                  <w:tcW w:type="dxa" w:w="3841"/>
-                  <w:shd w:val="clear" w:color="auto" w:fill="EDF4FC"/>
-                  <w:tcMar>
-                    <w:top w:w="48" w:type="dxa"/>
-                    <w:bottom w:w="48" w:type="dxa"/>
-                    <w:left w:w="100" w:type="dxa"/>
-                    <w:right w:w="100" w:type="dxa"/>
-                  </w:tcMar>
-                </w:tcPr>
-                <w:p>
-                  <w:pPr>
-                    <w:spacing w:before="0" w:after="0"/>
-                    <w:jc w:val="right"/>
-                  </w:pPr>
-                  <w:r>
-                    <w:rPr>
-                      <w:b/>
-                      <w:color w:val="1E3A6E"/>
-                      <w:sz w:val="18"/>
-                    </w:rPr>
-                    <w:t>$70</w:t>
-                  </w:r>
-                </w:p>
-              </w:tc>
-            </w:tr>
-            <w:tr>
-              <w:tc>
-                <w:tcPr>
-                  <w:tcW w:type="dxa" w:w="3841"/>
-                  <w:shd w:val="clear" w:color="auto" w:fill="FFFFFF"/>
-                  <w:tcMar>
-                    <w:top w:w="48" w:type="dxa"/>
-                    <w:bottom w:w="48" w:type="dxa"/>
-                    <w:left w:w="100" w:type="dxa"/>
-                    <w:right w:w="100" w:type="dxa"/>
-                  </w:tcMar>
-                </w:tcPr>
-                <w:p>
-                  <w:pPr>
-                    <w:spacing w:before="0" w:after="0"/>
-                    <w:jc w:val="left"/>
-                  </w:pPr>
-                  <w:r>
-                    <w:rPr>
-                      <w:b w:val="0"/>
-                      <w:color w:val="1A1A2E"/>
-                      <w:sz w:val="18"/>
-                    </w:rPr>
-                    <w:t>Moño</w:t>
-                  </w:r>
-                </w:p>
-              </w:tc>
-              <w:tc>
-                <w:tcPr>
-                  <w:tcW w:type="dxa" w:w="3841"/>
-                  <w:shd w:val="clear" w:color="auto" w:fill="FFFFFF"/>
-                  <w:tcMar>
-                    <w:top w:w="48" w:type="dxa"/>
-                    <w:bottom w:w="48" w:type="dxa"/>
-                    <w:left w:w="100" w:type="dxa"/>
-                    <w:right w:w="100" w:type="dxa"/>
-                  </w:tcMar>
-                </w:tcPr>
-                <w:p>
-                  <w:pPr>
-                    <w:spacing w:before="0" w:after="0"/>
-                    <w:jc w:val="right"/>
-                  </w:pPr>
-                  <w:r>
-                    <w:rPr>
-                      <w:b/>
-                      <w:color w:val="1E3A6E"/>
-                      <w:sz w:val="18"/>
-                    </w:rPr>
-                    <w:t>$70</w:t>
-                  </w:r>
-                </w:p>
-              </w:tc>
-            </w:tr>
-            <w:tr>
-              <w:tc>
-                <w:tcPr>
-                  <w:tcW w:type="dxa" w:w="3841"/>
-                  <w:shd w:val="clear" w:color="auto" w:fill="EDF4FC"/>
-                  <w:tcMar>
-                    <w:top w:w="48" w:type="dxa"/>
-                    <w:bottom w:w="48" w:type="dxa"/>
-                    <w:left w:w="100" w:type="dxa"/>
-                    <w:right w:w="100" w:type="dxa"/>
-                  </w:tcMar>
-                </w:tcPr>
-                <w:p>
-                  <w:pPr>
-                    <w:spacing w:before="0" w:after="0"/>
-                    <w:jc w:val="left"/>
-                  </w:pPr>
-                  <w:r>
-                    <w:rPr>
-                      <w:b w:val="0"/>
-                      <w:color w:val="1A1A2E"/>
-                      <w:sz w:val="18"/>
-                    </w:rPr>
-                    <w:t>Boina Escolta</w:t>
-                  </w:r>
-                </w:p>
-              </w:tc>
-              <w:tc>
-                <w:tcPr>
-                  <w:tcW w:type="dxa" w:w="3841"/>
-                  <w:shd w:val="clear" w:color="auto" w:fill="EDF4FC"/>
-                  <w:tcMar>
-                    <w:top w:w="48" w:type="dxa"/>
-                    <w:bottom w:w="48" w:type="dxa"/>
-                    <w:left w:w="100" w:type="dxa"/>
-                    <w:right w:w="100" w:type="dxa"/>
-                  </w:tcMar>
-                </w:tcPr>
-                <w:p>
-                  <w:pPr>
-                    <w:spacing w:before="0" w:after="0"/>
-                    <w:jc w:val="right"/>
-                  </w:pPr>
-                  <w:r>
-                    <w:rPr>
-                      <w:b/>
-                      <w:color w:val="1E3A6E"/>
-                      <w:sz w:val="18"/>
-                    </w:rPr>
-                    <w:t>$80</w:t>
+                    <w:t>$125</w:t>
                   </w:r>
                 </w:p>
               </w:tc>
@@ -582,6 +415,319 @@
               <w:tc>
                 <w:tcPr>
                   <w:tcW w:type="dxa" w:w="7682"/>
+                  <w:shd w:val="clear" w:color="auto" w:fill="B52020"/>
+                  <w:tcMar>
+                    <w:top w:w="70" w:type="dxa"/>
+                    <w:bottom w:w="70" w:type="dxa"/>
+                    <w:left w:w="140" w:type="dxa"/>
+                    <w:right w:w="140" w:type="dxa"/>
+                  </w:tcMar>
+                </w:tcPr>
+                <w:p>
+                  <w:pPr>
+                    <w:spacing w:before="0" w:after="0"/>
+                    <w:jc w:val="left"/>
+                  </w:pPr>
+                  <w:r>
+                    <w:rPr>
+                      <w:b/>
+                      <w:color w:val="FFFFFF"/>
+                      <w:sz w:val="20"/>
+                    </w:rPr>
+                    <w:t>Corbatín</w:t>
+                  </w:r>
+                </w:p>
+              </w:tc>
+            </w:tr>
+          </w:tbl>
+          <w:p/>
+          <w:tbl>
+            <w:tblPr>
+              <w:tblStyle w:val="TableGrid"/>
+              <w:tblW w:type="auto" w:w="0"/>
+              <w:tblLook w:firstColumn="1" w:firstRow="1" w:lastColumn="0" w:lastRow="0" w:noHBand="0" w:noVBand="1" w:val="04A0"/>
+            </w:tblPr>
+            <w:tblGrid>
+              <w:gridCol w:w="2561"/>
+              <w:gridCol w:w="2561"/>
+              <w:gridCol w:w="2561"/>
+            </w:tblGrid>
+            <w:tr>
+              <w:tc>
+                <w:tcPr>
+                  <w:tcW w:type="dxa" w:w="2561"/>
+                  <w:shd w:val="clear" w:color="auto" w:fill="FCE8E8"/>
+                  <w:tcMar>
+                    <w:top w:w="50" w:type="dxa"/>
+                    <w:bottom w:w="50" w:type="dxa"/>
+                    <w:left w:w="100" w:type="dxa"/>
+                    <w:right w:w="100" w:type="dxa"/>
+                  </w:tcMar>
+                </w:tcPr>
+                <w:p>
+                  <w:pPr>
+                    <w:spacing w:before="0" w:after="0"/>
+                    <w:jc w:val="left"/>
+                  </w:pPr>
+                  <w:r>
+                    <w:rPr>
+                      <w:b/>
+                      <w:color w:val="B52020"/>
+                      <w:sz w:val="17"/>
+                    </w:rPr>
+                    <w:t>Escuela / Producto</w:t>
+                  </w:r>
+                </w:p>
+              </w:tc>
+              <w:tc>
+                <w:tcPr>
+                  <w:tcW w:type="dxa" w:w="2561"/>
+                  <w:shd w:val="clear" w:color="auto" w:fill="FCE8E8"/>
+                  <w:tcMar>
+                    <w:top w:w="50" w:type="dxa"/>
+                    <w:bottom w:w="50" w:type="dxa"/>
+                    <w:left w:w="100" w:type="dxa"/>
+                    <w:right w:w="100" w:type="dxa"/>
+                  </w:tcMar>
+                </w:tcPr>
+                <w:p>
+                  <w:pPr>
+                    <w:spacing w:before="0" w:after="0"/>
+                    <w:jc w:val="right"/>
+                  </w:pPr>
+                  <w:r>
+                    <w:rPr>
+                      <w:b/>
+                      <w:color w:val="B52020"/>
+                      <w:sz w:val="17"/>
+                    </w:rPr>
+                    <w:t>Tallas</w:t>
+                  </w:r>
+                </w:p>
+              </w:tc>
+              <w:tc>
+                <w:tcPr>
+                  <w:tcW w:type="dxa" w:w="2561"/>
+                  <w:shd w:val="clear" w:color="auto" w:fill="FCE8E8"/>
+                  <w:tcMar>
+                    <w:top w:w="50" w:type="dxa"/>
+                    <w:bottom w:w="50" w:type="dxa"/>
+                    <w:left w:w="100" w:type="dxa"/>
+                    <w:right w:w="100" w:type="dxa"/>
+                  </w:tcMar>
+                </w:tcPr>
+                <w:p>
+                  <w:pPr>
+                    <w:spacing w:before="0" w:after="0"/>
+                    <w:jc w:val="right"/>
+                  </w:pPr>
+                  <w:r>
+                    <w:rPr>
+                      <w:b/>
+                      <w:color w:val="B52020"/>
+                      <w:sz w:val="17"/>
+                    </w:rPr>
+                    <w:t>Precio</w:t>
+                  </w:r>
+                </w:p>
+              </w:tc>
+            </w:tr>
+            <w:tr>
+              <w:tc>
+                <w:tcPr>
+                  <w:tcW w:type="dxa" w:w="2561"/>
+                  <w:shd w:val="clear" w:color="auto" w:fill="FFFFFF"/>
+                  <w:tcMar>
+                    <w:top w:w="48" w:type="dxa"/>
+                    <w:bottom w:w="48" w:type="dxa"/>
+                    <w:left w:w="100" w:type="dxa"/>
+                    <w:right w:w="100" w:type="dxa"/>
+                  </w:tcMar>
+                </w:tcPr>
+                <w:p>
+                  <w:pPr>
+                    <w:spacing w:before="0" w:after="0"/>
+                    <w:jc w:val="left"/>
+                  </w:pPr>
+                  <w:r>
+                    <w:rPr>
+                      <w:b w:val="0"/>
+                      <w:color w:val="1A1A2E"/>
+                      <w:sz w:val="18"/>
+                    </w:rPr>
+                    <w:t>Conalep</w:t>
+                  </w:r>
+                </w:p>
+              </w:tc>
+              <w:tc>
+                <w:tcPr>
+                  <w:tcW w:type="dxa" w:w="2561"/>
+                  <w:shd w:val="clear" w:color="auto" w:fill="FFFFFF"/>
+                  <w:tcMar>
+                    <w:top w:w="48" w:type="dxa"/>
+                    <w:bottom w:w="48" w:type="dxa"/>
+                    <w:left w:w="100" w:type="dxa"/>
+                    <w:right w:w="100" w:type="dxa"/>
+                  </w:tcMar>
+                </w:tcPr>
+                <w:p>
+                  <w:pPr>
+                    <w:spacing w:before="0" w:after="0"/>
+                    <w:jc w:val="right"/>
+                  </w:pPr>
+                  <w:r>
+                    <w:rPr>
+                      <w:b/>
+                      <w:color w:val="1E3A6E"/>
+                      <w:sz w:val="18"/>
+                    </w:rPr>
+                    <w:t>UNI</w:t>
+                  </w:r>
+                </w:p>
+              </w:tc>
+              <w:tc>
+                <w:tcPr>
+                  <w:tcW w:type="dxa" w:w="2561"/>
+                  <w:shd w:val="clear" w:color="auto" w:fill="FFFFFF"/>
+                  <w:tcMar>
+                    <w:top w:w="48" w:type="dxa"/>
+                    <w:bottom w:w="48" w:type="dxa"/>
+                    <w:left w:w="100" w:type="dxa"/>
+                    <w:right w:w="100" w:type="dxa"/>
+                  </w:tcMar>
+                </w:tcPr>
+                <w:p>
+                  <w:pPr>
+                    <w:spacing w:before="0" w:after="0"/>
+                    <w:jc w:val="right"/>
+                  </w:pPr>
+                  <w:r>
+                    <w:rPr>
+                      <w:b/>
+                      <w:color w:val="1E3A6E"/>
+                      <w:sz w:val="18"/>
+                    </w:rPr>
+                    <w:t>$125</w:t>
+                  </w:r>
+                </w:p>
+              </w:tc>
+            </w:tr>
+          </w:tbl>
+          <w:p/>
+          <w:p>
+            <w:pPr>
+              <w:spacing w:before="0" w:after="80"/>
+            </w:pPr>
+          </w:p>
+        </w:tc>
+      </w:tr>
+    </w:tbl>
+    <w:p>
+      <w:pPr>
+        <w:spacing w:before="0" w:after="120"/>
+      </w:pPr>
+    </w:p>
+    <w:tbl>
+      <w:tblPr>
+        <w:tblW w:type="auto" w:w="0"/>
+        <w:tblLook w:firstColumn="1" w:firstRow="1" w:lastColumn="0" w:lastRow="0" w:noHBand="0" w:noVBand="1" w:val="04A0"/>
+        <w:tblBorders>
+          <w:top w:val="none"/>
+          <w:left w:val="none"/>
+          <w:bottom w:val="none"/>
+          <w:right w:val="none"/>
+          <w:insideH w:val="none"/>
+          <w:insideV w:val="none"/>
+        </w:tblBorders>
+      </w:tblPr>
+      <w:tblGrid>
+        <w:gridCol w:w="15364"/>
+      </w:tblGrid>
+      <w:tr>
+        <w:tc>
+          <w:tcPr>
+            <w:tcW w:type="dxa" w:w="15364"/>
+            <w:shd w:val="clear" w:color="auto" w:fill="2E6FBF"/>
+            <w:tcMar>
+              <w:top w:w="80" w:type="dxa"/>
+              <w:bottom w:w="80" w:type="dxa"/>
+              <w:left w:w="180" w:type="dxa"/>
+              <w:right w:w="180" w:type="dxa"/>
+            </w:tcMar>
+          </w:tcPr>
+          <w:p>
+            <w:pPr>
+              <w:spacing w:before="0" w:after="0"/>
+              <w:jc w:val="left"/>
+            </w:pPr>
+            <w:r>
+              <w:rPr>
+                <w:b/>
+                <w:color w:val="FFFFFF"/>
+                <w:sz w:val="22"/>
+              </w:rPr>
+              <w:t>Precios generales</w:t>
+            </w:r>
+          </w:p>
+        </w:tc>
+      </w:tr>
+    </w:tbl>
+    <w:p>
+      <w:pPr>
+        <w:spacing w:before="0" w:after="40"/>
+      </w:pPr>
+    </w:p>
+    <w:tbl>
+      <w:tblPr>
+        <w:tblW w:type="auto" w:w="0"/>
+        <w:tblLook w:firstColumn="1" w:firstRow="1" w:lastColumn="0" w:lastRow="0" w:noHBand="0" w:noVBand="1" w:val="04A0"/>
+        <w:jc w:val="center"/>
+        <w:tblBorders>
+          <w:top w:val="none"/>
+          <w:left w:val="none"/>
+          <w:bottom w:val="none"/>
+          <w:right w:val="none"/>
+          <w:insideH w:val="none"/>
+          <w:insideV w:val="none"/>
+        </w:tblBorders>
+      </w:tblPr>
+      <w:tblGrid>
+        <w:gridCol w:w="5121"/>
+        <w:gridCol w:w="5121"/>
+        <w:gridCol w:w="5121"/>
+      </w:tblGrid>
+      <w:tr>
+        <w:tc>
+          <w:tcPr>
+            <w:tcW w:type="dxa" w:w="5121"/>
+            <w:tcMar>
+              <w:top w:w="0" w:type="dxa"/>
+              <w:bottom w:w="0" w:type="dxa"/>
+              <w:left w:w="60" w:type="dxa"/>
+              <w:right w:w="60" w:type="dxa"/>
+            </w:tcMar>
+          </w:tcPr>
+          <w:p/>
+          <w:tbl>
+            <w:tblPr>
+              <w:tblW w:type="auto" w:w="0"/>
+              <w:tblLook w:firstColumn="1" w:firstRow="1" w:lastColumn="0" w:lastRow="0" w:noHBand="0" w:noVBand="1" w:val="04A0"/>
+              <w:tblBorders>
+                <w:top w:val="none"/>
+                <w:left w:val="none"/>
+                <w:bottom w:val="none"/>
+                <w:right w:val="none"/>
+                <w:insideH w:val="none"/>
+                <w:insideV w:val="none"/>
+              </w:tblBorders>
+            </w:tblPr>
+            <w:tblGrid>
+              <w:gridCol w:w="5121"/>
+            </w:tblGrid>
+            <w:tr>
+              <w:tc>
+                <w:tcPr>
+                  <w:tcW w:type="dxa" w:w="5121"/>
                   <w:shd w:val="clear" w:color="auto" w:fill="2E6FBF"/>
                   <w:tcMar>
                     <w:top w:w="70" w:type="dxa"/>
@@ -601,7 +747,7 @@
                       <w:color w:val="FFFFFF"/>
                       <w:sz w:val="20"/>
                     </w:rPr>
-                    <w:t>Playera Polo Blanca</w:t>
+                    <w:t>Accesorios</w:t>
                   </w:r>
                 </w:p>
               </w:tc>
@@ -615,13 +761,13 @@
               <w:tblLook w:firstColumn="1" w:firstRow="1" w:lastColumn="0" w:lastRow="0" w:noHBand="0" w:noVBand="1" w:val="04A0"/>
             </w:tblPr>
             <w:tblGrid>
-              <w:gridCol w:w="3841"/>
-              <w:gridCol w:w="3841"/>
+              <w:gridCol w:w="2560"/>
+              <w:gridCol w:w="2560"/>
             </w:tblGrid>
             <w:tr>
               <w:tc>
                 <w:tcPr>
-                  <w:tcW w:type="dxa" w:w="3841"/>
+                  <w:tcW w:type="dxa" w:w="2560"/>
                   <w:shd w:val="clear" w:color="auto" w:fill="D6E8F7"/>
                   <w:tcMar>
                     <w:top w:w="50" w:type="dxa"/>
@@ -641,13 +787,13 @@
                       <w:color w:val="2E6FBF"/>
                       <w:sz w:val="17"/>
                     </w:rPr>
-                    <w:t>Tallas</w:t>
+                    <w:t>Pieza</w:t>
                   </w:r>
                 </w:p>
               </w:tc>
               <w:tc>
                 <w:tcPr>
-                  <w:tcW w:type="dxa" w:w="3841"/>
+                  <w:tcW w:type="dxa" w:w="2560"/>
                   <w:shd w:val="clear" w:color="auto" w:fill="D6E8F7"/>
                   <w:tcMar>
                     <w:top w:w="50" w:type="dxa"/>
@@ -675,7 +821,7 @@
             <w:tr>
               <w:tc>
                 <w:tcPr>
-                  <w:tcW w:type="dxa" w:w="3841"/>
+                  <w:tcW w:type="dxa" w:w="2560"/>
                   <w:shd w:val="clear" w:color="auto" w:fill="FFFFFF"/>
                   <w:tcMar>
                     <w:top w:w="48" w:type="dxa"/>
@@ -695,13 +841,13 @@
                       <w:color w:val="1A1A2E"/>
                       <w:sz w:val="18"/>
                     </w:rPr>
-                    <w:t>2, 4, 6, 8</w:t>
+                    <w:t>Calceta Escolar</w:t>
                   </w:r>
                 </w:p>
               </w:tc>
               <w:tc>
                 <w:tcPr>
-                  <w:tcW w:type="dxa" w:w="3841"/>
+                  <w:tcW w:type="dxa" w:w="2560"/>
                   <w:shd w:val="clear" w:color="auto" w:fill="FFFFFF"/>
                   <w:tcMar>
                     <w:top w:w="48" w:type="dxa"/>
@@ -721,7 +867,7 @@
                       <w:color w:val="1E3A6E"/>
                       <w:sz w:val="18"/>
                     </w:rPr>
-                    <w:t>$135</w:t>
+                    <w:t>$49</w:t>
                   </w:r>
                 </w:p>
               </w:tc>
@@ -729,7 +875,7 @@
             <w:tr>
               <w:tc>
                 <w:tcPr>
-                  <w:tcW w:type="dxa" w:w="3841"/>
+                  <w:tcW w:type="dxa" w:w="2560"/>
                   <w:shd w:val="clear" w:color="auto" w:fill="EDF4FC"/>
                   <w:tcMar>
                     <w:top w:w="48" w:type="dxa"/>
@@ -749,13 +895,13 @@
                       <w:color w:val="1A1A2E"/>
                       <w:sz w:val="18"/>
                     </w:rPr>
-                    <w:t>10, 12</w:t>
+                    <w:t>Guante Escolta</w:t>
                   </w:r>
                 </w:p>
               </w:tc>
               <w:tc>
                 <w:tcPr>
-                  <w:tcW w:type="dxa" w:w="3841"/>
+                  <w:tcW w:type="dxa" w:w="2560"/>
                   <w:shd w:val="clear" w:color="auto" w:fill="EDF4FC"/>
                   <w:tcMar>
                     <w:top w:w="48" w:type="dxa"/>
@@ -775,7 +921,7 @@
                       <w:color w:val="1E3A6E"/>
                       <w:sz w:val="18"/>
                     </w:rPr>
-                    <w:t>$145</w:t>
+                    <w:t>$49</w:t>
                   </w:r>
                 </w:p>
               </w:tc>
@@ -783,7 +929,7 @@
             <w:tr>
               <w:tc>
                 <w:tcPr>
-                  <w:tcW w:type="dxa" w:w="3841"/>
+                  <w:tcW w:type="dxa" w:w="2560"/>
                   <w:shd w:val="clear" w:color="auto" w:fill="FFFFFF"/>
                   <w:tcMar>
                     <w:top w:w="48" w:type="dxa"/>
@@ -803,13 +949,13 @@
                       <w:color w:val="1A1A2E"/>
                       <w:sz w:val="18"/>
                     </w:rPr>
-                    <w:t>14, 16, 18</w:t>
+                    <w:t>Corbata</w:t>
                   </w:r>
                 </w:p>
               </w:tc>
               <w:tc>
                 <w:tcPr>
-                  <w:tcW w:type="dxa" w:w="3841"/>
+                  <w:tcW w:type="dxa" w:w="2560"/>
                   <w:shd w:val="clear" w:color="auto" w:fill="FFFFFF"/>
                   <w:tcMar>
                     <w:top w:w="48" w:type="dxa"/>
@@ -829,7 +975,7 @@
                       <w:color w:val="1E3A6E"/>
                       <w:sz w:val="18"/>
                     </w:rPr>
-                    <w:t>$155</w:t>
+                    <w:t>$70</w:t>
                   </w:r>
                 </w:p>
               </w:tc>
@@ -837,7 +983,7 @@
             <w:tr>
               <w:tc>
                 <w:tcPr>
-                  <w:tcW w:type="dxa" w:w="3841"/>
+                  <w:tcW w:type="dxa" w:w="2560"/>
                   <w:shd w:val="clear" w:color="auto" w:fill="EDF4FC"/>
                   <w:tcMar>
                     <w:top w:w="48" w:type="dxa"/>
@@ -857,13 +1003,13 @@
                       <w:color w:val="1A1A2E"/>
                       <w:sz w:val="18"/>
                     </w:rPr>
-                    <w:t>28, 30, 32, 34, 36, 38</w:t>
+                    <w:t>Corbatín</w:t>
                   </w:r>
                 </w:p>
               </w:tc>
               <w:tc>
                 <w:tcPr>
-                  <w:tcW w:type="dxa" w:w="3841"/>
+                  <w:tcW w:type="dxa" w:w="2560"/>
                   <w:shd w:val="clear" w:color="auto" w:fill="EDF4FC"/>
                   <w:tcMar>
                     <w:top w:w="48" w:type="dxa"/>
@@ -883,7 +1029,7 @@
                       <w:color w:val="1E3A6E"/>
                       <w:sz w:val="18"/>
                     </w:rPr>
-                    <w:t>$170</w:t>
+                    <w:t>$70</w:t>
                   </w:r>
                 </w:p>
               </w:tc>
@@ -891,7 +1037,7 @@
             <w:tr>
               <w:tc>
                 <w:tcPr>
-                  <w:tcW w:type="dxa" w:w="3841"/>
+                  <w:tcW w:type="dxa" w:w="2560"/>
                   <w:shd w:val="clear" w:color="auto" w:fill="FFFFFF"/>
                   <w:tcMar>
                     <w:top w:w="48" w:type="dxa"/>
@@ -911,13 +1057,13 @@
                       <w:color w:val="1A1A2E"/>
                       <w:sz w:val="18"/>
                     </w:rPr>
-                    <w:t>40, 42</w:t>
+                    <w:t>Moño</w:t>
                   </w:r>
                 </w:p>
               </w:tc>
               <w:tc>
                 <w:tcPr>
-                  <w:tcW w:type="dxa" w:w="3841"/>
+                  <w:tcW w:type="dxa" w:w="2560"/>
                   <w:shd w:val="clear" w:color="auto" w:fill="FFFFFF"/>
                   <w:tcMar>
                     <w:top w:w="48" w:type="dxa"/>
@@ -937,7 +1083,7 @@
                       <w:color w:val="1E3A6E"/>
                       <w:sz w:val="18"/>
                     </w:rPr>
-                    <w:t>$180</w:t>
+                    <w:t>$70</w:t>
                   </w:r>
                 </w:p>
               </w:tc>
@@ -945,7 +1091,7 @@
             <w:tr>
               <w:tc>
                 <w:tcPr>
-                  <w:tcW w:type="dxa" w:w="3841"/>
+                  <w:tcW w:type="dxa" w:w="2560"/>
                   <w:shd w:val="clear" w:color="auto" w:fill="EDF4FC"/>
                   <w:tcMar>
                     <w:top w:w="48" w:type="dxa"/>
@@ -965,13 +1111,13 @@
                       <w:color w:val="1A1A2E"/>
                       <w:sz w:val="18"/>
                     </w:rPr>
-                    <w:t>CH, MD</w:t>
+                    <w:t>Boina Escolta</w:t>
                   </w:r>
                 </w:p>
               </w:tc>
               <w:tc>
                 <w:tcPr>
-                  <w:tcW w:type="dxa" w:w="3841"/>
+                  <w:tcW w:type="dxa" w:w="2560"/>
                   <w:shd w:val="clear" w:color="auto" w:fill="EDF4FC"/>
                   <w:tcMar>
                     <w:top w:w="48" w:type="dxa"/>
@@ -991,7 +1137,136 @@
                       <w:color w:val="1E3A6E"/>
                       <w:sz w:val="18"/>
                     </w:rPr>
-                    <w:t>$185</w:t>
+                    <w:t>$85</w:t>
+                  </w:r>
+                </w:p>
+              </w:tc>
+            </w:tr>
+          </w:tbl>
+          <w:p/>
+          <w:p>
+            <w:pPr>
+              <w:spacing w:before="0" w:after="80"/>
+            </w:pPr>
+          </w:p>
+        </w:tc>
+        <w:tc>
+          <w:tcPr>
+            <w:tcW w:type="dxa" w:w="5121"/>
+            <w:tcMar>
+              <w:top w:w="0" w:type="dxa"/>
+              <w:bottom w:w="0" w:type="dxa"/>
+              <w:left w:w="60" w:type="dxa"/>
+              <w:right w:w="60" w:type="dxa"/>
+            </w:tcMar>
+          </w:tcPr>
+          <w:p/>
+          <w:tbl>
+            <w:tblPr>
+              <w:tblW w:type="auto" w:w="0"/>
+              <w:tblLook w:firstColumn="1" w:firstRow="1" w:lastColumn="0" w:lastRow="0" w:noHBand="0" w:noVBand="1" w:val="04A0"/>
+              <w:tblBorders>
+                <w:top w:val="none"/>
+                <w:left w:val="none"/>
+                <w:bottom w:val="none"/>
+                <w:right w:val="none"/>
+                <w:insideH w:val="none"/>
+                <w:insideV w:val="none"/>
+              </w:tblBorders>
+            </w:tblPr>
+            <w:tblGrid>
+              <w:gridCol w:w="5121"/>
+            </w:tblGrid>
+            <w:tr>
+              <w:tc>
+                <w:tcPr>
+                  <w:tcW w:type="dxa" w:w="5121"/>
+                  <w:shd w:val="clear" w:color="auto" w:fill="2E6FBF"/>
+                  <w:tcMar>
+                    <w:top w:w="70" w:type="dxa"/>
+                    <w:bottom w:w="70" w:type="dxa"/>
+                    <w:left w:w="140" w:type="dxa"/>
+                    <w:right w:w="140" w:type="dxa"/>
+                  </w:tcMar>
+                </w:tcPr>
+                <w:p>
+                  <w:pPr>
+                    <w:spacing w:before="0" w:after="0"/>
+                    <w:jc w:val="left"/>
+                  </w:pPr>
+                  <w:r>
+                    <w:rPr>
+                      <w:b/>
+                      <w:color w:val="FFFFFF"/>
+                      <w:sz w:val="20"/>
+                    </w:rPr>
+                    <w:t>Malla Escolar</w:t>
+                  </w:r>
+                </w:p>
+              </w:tc>
+            </w:tr>
+          </w:tbl>
+          <w:p/>
+          <w:tbl>
+            <w:tblPr>
+              <w:tblStyle w:val="TableGrid"/>
+              <w:tblW w:type="auto" w:w="0"/>
+              <w:tblLook w:firstColumn="1" w:firstRow="1" w:lastColumn="0" w:lastRow="0" w:noHBand="0" w:noVBand="1" w:val="04A0"/>
+            </w:tblPr>
+            <w:tblGrid>
+              <w:gridCol w:w="2560"/>
+              <w:gridCol w:w="2560"/>
+            </w:tblGrid>
+            <w:tr>
+              <w:tc>
+                <w:tcPr>
+                  <w:tcW w:type="dxa" w:w="2560"/>
+                  <w:shd w:val="clear" w:color="auto" w:fill="D6E8F7"/>
+                  <w:tcMar>
+                    <w:top w:w="50" w:type="dxa"/>
+                    <w:bottom w:w="50" w:type="dxa"/>
+                    <w:left w:w="100" w:type="dxa"/>
+                    <w:right w:w="100" w:type="dxa"/>
+                  </w:tcMar>
+                </w:tcPr>
+                <w:p>
+                  <w:pPr>
+                    <w:spacing w:before="0" w:after="0"/>
+                    <w:jc w:val="left"/>
+                  </w:pPr>
+                  <w:r>
+                    <w:rPr>
+                      <w:b/>
+                      <w:color w:val="2E6FBF"/>
+                      <w:sz w:val="17"/>
+                    </w:rPr>
+                    <w:t>Tallas</w:t>
+                  </w:r>
+                </w:p>
+              </w:tc>
+              <w:tc>
+                <w:tcPr>
+                  <w:tcW w:type="dxa" w:w="2560"/>
+                  <w:shd w:val="clear" w:color="auto" w:fill="D6E8F7"/>
+                  <w:tcMar>
+                    <w:top w:w="50" w:type="dxa"/>
+                    <w:bottom w:w="50" w:type="dxa"/>
+                    <w:left w:w="100" w:type="dxa"/>
+                    <w:right w:w="100" w:type="dxa"/>
+                  </w:tcMar>
+                </w:tcPr>
+                <w:p>
+                  <w:pPr>
+                    <w:spacing w:before="0" w:after="0"/>
+                    <w:jc w:val="right"/>
+                  </w:pPr>
+                  <w:r>
+                    <w:rPr>
+                      <w:b/>
+                      <w:color w:val="2E6FBF"/>
+                      <w:sz w:val="17"/>
+                    </w:rPr>
+                    <w:t>Precio</w:t>
                   </w:r>
                 </w:p>
               </w:tc>
@@ -999,7 +1274,7 @@
             <w:tr>
               <w:tc>
                 <w:tcPr>
-                  <w:tcW w:type="dxa" w:w="3841"/>
+                  <w:tcW w:type="dxa" w:w="2560"/>
                   <w:shd w:val="clear" w:color="auto" w:fill="FFFFFF"/>
                   <w:tcMar>
                     <w:top w:w="48" w:type="dxa"/>
@@ -1019,13 +1294,13 @@
                       <w:color w:val="1A1A2E"/>
                       <w:sz w:val="18"/>
                     </w:rPr>
-                    <w:t>GD, EXG</w:t>
+                    <w:t>0-0, 0-2, 3-5, 6-8</w:t>
                   </w:r>
                 </w:p>
               </w:tc>
               <w:tc>
                 <w:tcPr>
-                  <w:tcW w:type="dxa" w:w="3841"/>
+                  <w:tcW w:type="dxa" w:w="2560"/>
                   <w:shd w:val="clear" w:color="auto" w:fill="FFFFFF"/>
                   <w:tcMar>
                     <w:top w:w="48" w:type="dxa"/>
@@ -1045,7 +1320,511 @@
                       <w:color w:val="1E3A6E"/>
                       <w:sz w:val="18"/>
                     </w:rPr>
-                    <w:t>$195</w:t>
+                    <w:t>$109</w:t>
+                  </w:r>
+                </w:p>
+              </w:tc>
+            </w:tr>
+            <w:tr>
+              <w:tc>
+                <w:tcPr>
+                  <w:tcW w:type="dxa" w:w="2560"/>
+                  <w:shd w:val="clear" w:color="auto" w:fill="EDF4FC"/>
+                  <w:tcMar>
+                    <w:top w:w="48" w:type="dxa"/>
+                    <w:bottom w:w="48" w:type="dxa"/>
+                    <w:left w:w="100" w:type="dxa"/>
+                    <w:right w:w="100" w:type="dxa"/>
+                  </w:tcMar>
+                </w:tcPr>
+                <w:p>
+                  <w:pPr>
+                    <w:spacing w:before="0" w:after="0"/>
+                    <w:jc w:val="left"/>
+                  </w:pPr>
+                  <w:r>
+                    <w:rPr>
+                      <w:b w:val="0"/>
+                      <w:color w:val="1A1A2E"/>
+                      <w:sz w:val="18"/>
+                    </w:rPr>
+                    <w:t>9-12</w:t>
+                  </w:r>
+                </w:p>
+              </w:tc>
+              <w:tc>
+                <w:tcPr>
+                  <w:tcW w:type="dxa" w:w="2560"/>
+                  <w:shd w:val="clear" w:color="auto" w:fill="EDF4FC"/>
+                  <w:tcMar>
+                    <w:top w:w="48" w:type="dxa"/>
+                    <w:bottom w:w="48" w:type="dxa"/>
+                    <w:left w:w="100" w:type="dxa"/>
+                    <w:right w:w="100" w:type="dxa"/>
+                  </w:tcMar>
+                </w:tcPr>
+                <w:p>
+                  <w:pPr>
+                    <w:spacing w:before="0" w:after="0"/>
+                    <w:jc w:val="right"/>
+                  </w:pPr>
+                  <w:r>
+                    <w:rPr>
+                      <w:b/>
+                      <w:color w:val="1E3A6E"/>
+                      <w:sz w:val="18"/>
+                    </w:rPr>
+                    <w:t>$129</w:t>
+                  </w:r>
+                </w:p>
+              </w:tc>
+            </w:tr>
+            <w:tr>
+              <w:tc>
+                <w:tcPr>
+                  <w:tcW w:type="dxa" w:w="2560"/>
+                  <w:shd w:val="clear" w:color="auto" w:fill="FFFFFF"/>
+                  <w:tcMar>
+                    <w:top w:w="48" w:type="dxa"/>
+                    <w:bottom w:w="48" w:type="dxa"/>
+                    <w:left w:w="100" w:type="dxa"/>
+                    <w:right w:w="100" w:type="dxa"/>
+                  </w:tcMar>
+                </w:tcPr>
+                <w:p>
+                  <w:pPr>
+                    <w:spacing w:before="0" w:after="0"/>
+                    <w:jc w:val="left"/>
+                  </w:pPr>
+                  <w:r>
+                    <w:rPr>
+                      <w:b w:val="0"/>
+                      <w:color w:val="1A1A2E"/>
+                      <w:sz w:val="18"/>
+                    </w:rPr>
+                    <w:t>13-18, CH-MD, GD-EXG, DAMA</w:t>
+                  </w:r>
+                </w:p>
+              </w:tc>
+              <w:tc>
+                <w:tcPr>
+                  <w:tcW w:type="dxa" w:w="2560"/>
+                  <w:shd w:val="clear" w:color="auto" w:fill="FFFFFF"/>
+                  <w:tcMar>
+                    <w:top w:w="48" w:type="dxa"/>
+                    <w:bottom w:w="48" w:type="dxa"/>
+                    <w:left w:w="100" w:type="dxa"/>
+                    <w:right w:w="100" w:type="dxa"/>
+                  </w:tcMar>
+                </w:tcPr>
+                <w:p>
+                  <w:pPr>
+                    <w:spacing w:before="0" w:after="0"/>
+                    <w:jc w:val="right"/>
+                  </w:pPr>
+                  <w:r>
+                    <w:rPr>
+                      <w:b/>
+                      <w:color w:val="1E3A6E"/>
+                      <w:sz w:val="18"/>
+                    </w:rPr>
+                    <w:t>$139</w:t>
+                  </w:r>
+                </w:p>
+              </w:tc>
+            </w:tr>
+          </w:tbl>
+          <w:p/>
+          <w:p>
+            <w:pPr>
+              <w:spacing w:before="0" w:after="80"/>
+            </w:pPr>
+          </w:p>
+        </w:tc>
+        <w:tc>
+          <w:tcPr>
+            <w:tcW w:type="dxa" w:w="5121"/>
+            <w:tcMar>
+              <w:top w:w="0" w:type="dxa"/>
+              <w:bottom w:w="0" w:type="dxa"/>
+              <w:left w:w="60" w:type="dxa"/>
+              <w:right w:w="60" w:type="dxa"/>
+            </w:tcMar>
+          </w:tcPr>
+          <w:p/>
+          <w:tbl>
+            <w:tblPr>
+              <w:tblW w:type="auto" w:w="0"/>
+              <w:tblLook w:firstColumn="1" w:firstRow="1" w:lastColumn="0" w:lastRow="0" w:noHBand="0" w:noVBand="1" w:val="04A0"/>
+              <w:tblBorders>
+                <w:top w:val="none"/>
+                <w:left w:val="none"/>
+                <w:bottom w:val="none"/>
+                <w:right w:val="none"/>
+                <w:insideH w:val="none"/>
+                <w:insideV w:val="none"/>
+              </w:tblBorders>
+            </w:tblPr>
+            <w:tblGrid>
+              <w:gridCol w:w="5121"/>
+            </w:tblGrid>
+            <w:tr>
+              <w:tc>
+                <w:tcPr>
+                  <w:tcW w:type="dxa" w:w="5121"/>
+                  <w:shd w:val="clear" w:color="auto" w:fill="2E6FBF"/>
+                  <w:tcMar>
+                    <w:top w:w="70" w:type="dxa"/>
+                    <w:bottom w:w="70" w:type="dxa"/>
+                    <w:left w:w="140" w:type="dxa"/>
+                    <w:right w:w="140" w:type="dxa"/>
+                  </w:tcMar>
+                </w:tcPr>
+                <w:p>
+                  <w:pPr>
+                    <w:spacing w:before="0" w:after="0"/>
+                    <w:jc w:val="left"/>
+                  </w:pPr>
+                  <w:r>
+                    <w:rPr>
+                      <w:b/>
+                      <w:color w:val="FFFFFF"/>
+                      <w:sz w:val="20"/>
+                    </w:rPr>
+                    <w:t>Bata</w:t>
+                  </w:r>
+                </w:p>
+              </w:tc>
+            </w:tr>
+          </w:tbl>
+          <w:p/>
+          <w:tbl>
+            <w:tblPr>
+              <w:tblStyle w:val="TableGrid"/>
+              <w:tblW w:type="auto" w:w="0"/>
+              <w:tblLook w:firstColumn="1" w:firstRow="1" w:lastColumn="0" w:lastRow="0" w:noHBand="0" w:noVBand="1" w:val="04A0"/>
+            </w:tblPr>
+            <w:tblGrid>
+              <w:gridCol w:w="1707"/>
+              <w:gridCol w:w="1707"/>
+              <w:gridCol w:w="1707"/>
+            </w:tblGrid>
+            <w:tr>
+              <w:tc>
+                <w:tcPr>
+                  <w:tcW w:type="dxa" w:w="1707"/>
+                  <w:shd w:val="clear" w:color="auto" w:fill="D6E8F7"/>
+                  <w:tcMar>
+                    <w:top w:w="50" w:type="dxa"/>
+                    <w:bottom w:w="50" w:type="dxa"/>
+                    <w:left w:w="100" w:type="dxa"/>
+                    <w:right w:w="100" w:type="dxa"/>
+                  </w:tcMar>
+                </w:tcPr>
+                <w:p>
+                  <w:pPr>
+                    <w:spacing w:before="0" w:after="0"/>
+                    <w:jc w:val="left"/>
+                  </w:pPr>
+                  <w:r>
+                    <w:rPr>
+                      <w:b/>
+                      <w:color w:val="2E6FBF"/>
+                      <w:sz w:val="17"/>
+                    </w:rPr>
+                    <w:t>Tipo</w:t>
+                  </w:r>
+                </w:p>
+              </w:tc>
+              <w:tc>
+                <w:tcPr>
+                  <w:tcW w:type="dxa" w:w="1707"/>
+                  <w:shd w:val="clear" w:color="auto" w:fill="D6E8F7"/>
+                  <w:tcMar>
+                    <w:top w:w="50" w:type="dxa"/>
+                    <w:bottom w:w="50" w:type="dxa"/>
+                    <w:left w:w="100" w:type="dxa"/>
+                    <w:right w:w="100" w:type="dxa"/>
+                  </w:tcMar>
+                </w:tcPr>
+                <w:p>
+                  <w:pPr>
+                    <w:spacing w:before="0" w:after="0"/>
+                    <w:jc w:val="right"/>
+                  </w:pPr>
+                  <w:r>
+                    <w:rPr>
+                      <w:b/>
+                      <w:color w:val="2E6FBF"/>
+                      <w:sz w:val="17"/>
+                    </w:rPr>
+                    <w:t>Tallas</w:t>
+                  </w:r>
+                </w:p>
+              </w:tc>
+              <w:tc>
+                <w:tcPr>
+                  <w:tcW w:type="dxa" w:w="1707"/>
+                  <w:shd w:val="clear" w:color="auto" w:fill="D6E8F7"/>
+                  <w:tcMar>
+                    <w:top w:w="50" w:type="dxa"/>
+                    <w:bottom w:w="50" w:type="dxa"/>
+                    <w:left w:w="100" w:type="dxa"/>
+                    <w:right w:w="100" w:type="dxa"/>
+                  </w:tcMar>
+                </w:tcPr>
+                <w:p>
+                  <w:pPr>
+                    <w:spacing w:before="0" w:after="0"/>
+                    <w:jc w:val="right"/>
+                  </w:pPr>
+                  <w:r>
+                    <w:rPr>
+                      <w:b/>
+                      <w:color w:val="2E6FBF"/>
+                      <w:sz w:val="17"/>
+                    </w:rPr>
+                    <w:t>Precio</w:t>
+                  </w:r>
+                </w:p>
+              </w:tc>
+            </w:tr>
+            <w:tr>
+              <w:tc>
+                <w:tcPr>
+                  <w:tcW w:type="dxa" w:w="1707"/>
+                  <w:shd w:val="clear" w:color="auto" w:fill="FFFFFF"/>
+                  <w:tcMar>
+                    <w:top w:w="48" w:type="dxa"/>
+                    <w:bottom w:w="48" w:type="dxa"/>
+                    <w:left w:w="100" w:type="dxa"/>
+                    <w:right w:w="100" w:type="dxa"/>
+                  </w:tcMar>
+                </w:tcPr>
+                <w:p>
+                  <w:pPr>
+                    <w:spacing w:before="0" w:after="0"/>
+                    <w:jc w:val="left"/>
+                  </w:pPr>
+                  <w:r>
+                    <w:rPr>
+                      <w:b w:val="0"/>
+                      <w:color w:val="1A1A2E"/>
+                      <w:sz w:val="18"/>
+                    </w:rPr>
+                    <w:t>Infantil</w:t>
+                  </w:r>
+                </w:p>
+              </w:tc>
+              <w:tc>
+                <w:tcPr>
+                  <w:tcW w:type="dxa" w:w="1707"/>
+                  <w:shd w:val="clear" w:color="auto" w:fill="FFFFFF"/>
+                  <w:tcMar>
+                    <w:top w:w="48" w:type="dxa"/>
+                    <w:bottom w:w="48" w:type="dxa"/>
+                    <w:left w:w="100" w:type="dxa"/>
+                    <w:right w:w="100" w:type="dxa"/>
+                  </w:tcMar>
+                </w:tcPr>
+                <w:p>
+                  <w:pPr>
+                    <w:spacing w:before="0" w:after="0"/>
+                    <w:jc w:val="right"/>
+                  </w:pPr>
+                  <w:r>
+                    <w:rPr>
+                      <w:b/>
+                      <w:color w:val="1E3A6E"/>
+                      <w:sz w:val="18"/>
+                    </w:rPr>
+                    <w:t>UNI</w:t>
+                  </w:r>
+                </w:p>
+              </w:tc>
+              <w:tc>
+                <w:tcPr>
+                  <w:tcW w:type="dxa" w:w="1707"/>
+                  <w:shd w:val="clear" w:color="auto" w:fill="FFFFFF"/>
+                  <w:tcMar>
+                    <w:top w:w="48" w:type="dxa"/>
+                    <w:bottom w:w="48" w:type="dxa"/>
+                    <w:left w:w="100" w:type="dxa"/>
+                    <w:right w:w="100" w:type="dxa"/>
+                  </w:tcMar>
+                </w:tcPr>
+                <w:p>
+                  <w:pPr>
+                    <w:spacing w:before="0" w:after="0"/>
+                    <w:jc w:val="right"/>
+                  </w:pPr>
+                  <w:r>
+                    <w:rPr>
+                      <w:b/>
+                      <w:color w:val="1E3A6E"/>
+                      <w:sz w:val="18"/>
+                    </w:rPr>
+                    <w:t>$65</w:t>
+                  </w:r>
+                </w:p>
+              </w:tc>
+            </w:tr>
+            <w:tr>
+              <w:tc>
+                <w:tcPr>
+                  <w:tcW w:type="dxa" w:w="1707"/>
+                  <w:shd w:val="clear" w:color="auto" w:fill="EDF4FC"/>
+                  <w:tcMar>
+                    <w:top w:w="48" w:type="dxa"/>
+                    <w:bottom w:w="48" w:type="dxa"/>
+                    <w:left w:w="100" w:type="dxa"/>
+                    <w:right w:w="100" w:type="dxa"/>
+                  </w:tcMar>
+                </w:tcPr>
+                <w:p>
+                  <w:pPr>
+                    <w:spacing w:before="0" w:after="0"/>
+                    <w:jc w:val="left"/>
+                  </w:pPr>
+                  <w:r>
+                    <w:rPr>
+                      <w:b w:val="0"/>
+                      <w:color w:val="1A1A2E"/>
+                      <w:sz w:val="18"/>
+                    </w:rPr>
+                    <w:t>Manga Corta</w:t>
+                  </w:r>
+                </w:p>
+              </w:tc>
+              <w:tc>
+                <w:tcPr>
+                  <w:tcW w:type="dxa" w:w="1707"/>
+                  <w:shd w:val="clear" w:color="auto" w:fill="EDF4FC"/>
+                  <w:tcMar>
+                    <w:top w:w="48" w:type="dxa"/>
+                    <w:bottom w:w="48" w:type="dxa"/>
+                    <w:left w:w="100" w:type="dxa"/>
+                    <w:right w:w="100" w:type="dxa"/>
+                  </w:tcMar>
+                </w:tcPr>
+                <w:p>
+                  <w:pPr>
+                    <w:spacing w:before="0" w:after="0"/>
+                    <w:jc w:val="right"/>
+                  </w:pPr>
+                  <w:r>
+                    <w:rPr>
+                      <w:b/>
+                      <w:color w:val="1E3A6E"/>
+                      <w:sz w:val="18"/>
+                    </w:rPr>
+                    <w:t>12, 14, 16, 18, 20, 28, 32, 34, 36, 38, 40, 42, 44, 46</w:t>
+                  </w:r>
+                </w:p>
+              </w:tc>
+              <w:tc>
+                <w:tcPr>
+                  <w:tcW w:type="dxa" w:w="1707"/>
+                  <w:shd w:val="clear" w:color="auto" w:fill="EDF4FC"/>
+                  <w:tcMar>
+                    <w:top w:w="48" w:type="dxa"/>
+                    <w:bottom w:w="48" w:type="dxa"/>
+                    <w:left w:w="100" w:type="dxa"/>
+                    <w:right w:w="100" w:type="dxa"/>
+                  </w:tcMar>
+                </w:tcPr>
+                <w:p>
+                  <w:pPr>
+                    <w:spacing w:before="0" w:after="0"/>
+                    <w:jc w:val="right"/>
+                  </w:pPr>
+                  <w:r>
+                    <w:rPr>
+                      <w:b/>
+                      <w:color w:val="1E3A6E"/>
+                      <w:sz w:val="18"/>
+                    </w:rPr>
+                    <w:t>$395</w:t>
+                  </w:r>
+                </w:p>
+              </w:tc>
+            </w:tr>
+            <w:tr>
+              <w:tc>
+                <w:tcPr>
+                  <w:tcW w:type="dxa" w:w="1707"/>
+                  <w:shd w:val="clear" w:color="auto" w:fill="FFFFFF"/>
+                  <w:tcMar>
+                    <w:top w:w="48" w:type="dxa"/>
+                    <w:bottom w:w="48" w:type="dxa"/>
+                    <w:left w:w="100" w:type="dxa"/>
+                    <w:right w:w="100" w:type="dxa"/>
+                  </w:tcMar>
+                </w:tcPr>
+                <w:p>
+                  <w:pPr>
+                    <w:spacing w:before="0" w:after="0"/>
+                    <w:jc w:val="left"/>
+                  </w:pPr>
+                  <w:r>
+                    <w:rPr>
+                      <w:b w:val="0"/>
+                      <w:color w:val="1A1A2E"/>
+                      <w:sz w:val="18"/>
+                    </w:rPr>
+                    <w:t>Manga Larga</w:t>
+                  </w:r>
+                </w:p>
+              </w:tc>
+              <w:tc>
+                <w:tcPr>
+                  <w:tcW w:type="dxa" w:w="1707"/>
+                  <w:shd w:val="clear" w:color="auto" w:fill="FFFFFF"/>
+                  <w:tcMar>
+                    <w:top w:w="48" w:type="dxa"/>
+                    <w:bottom w:w="48" w:type="dxa"/>
+                    <w:left w:w="100" w:type="dxa"/>
+                    <w:right w:w="100" w:type="dxa"/>
+                  </w:tcMar>
+                </w:tcPr>
+                <w:p>
+                  <w:pPr>
+                    <w:spacing w:before="0" w:after="0"/>
+                    <w:jc w:val="right"/>
+                  </w:pPr>
+                  <w:r>
+                    <w:rPr>
+                      <w:b/>
+                      <w:color w:val="1E3A6E"/>
+                      <w:sz w:val="18"/>
+                    </w:rPr>
+                    <w:t>12, 14, 16, 18, 20, 28, 32, 34, 36, 38, 40, 42, 44, 46</w:t>
+                  </w:r>
+                </w:p>
+              </w:tc>
+              <w:tc>
+                <w:tcPr>
+                  <w:tcW w:type="dxa" w:w="1707"/>
+                  <w:shd w:val="clear" w:color="auto" w:fill="FFFFFF"/>
+                  <w:tcMar>
+                    <w:top w:w="48" w:type="dxa"/>
+                    <w:bottom w:w="48" w:type="dxa"/>
+                    <w:left w:w="100" w:type="dxa"/>
+                    <w:right w:w="100" w:type="dxa"/>
+                  </w:tcMar>
+                </w:tcPr>
+                <w:p>
+                  <w:pPr>
+                    <w:spacing w:before="0" w:after="0"/>
+                    <w:jc w:val="right"/>
+                  </w:pPr>
+                  <w:r>
+                    <w:rPr>
+                      <w:b/>
+                      <w:color w:val="1E3A6E"/>
+                      <w:sz w:val="18"/>
+                    </w:rPr>
+                    <w:t>$365</w:t>
                   </w:r>
                 </w:p>
               </w:tc>
@@ -1064,19 +1843,6 @@
       <w:pPr>
         <w:spacing w:before="0" w:after="120"/>
       </w:pPr>
-    </w:p>
-    <w:p>
-      <w:pPr>
-        <w:spacing w:before="0" w:after="40"/>
-      </w:pPr>
-      <w:r>
-        <w:rPr>
-          <w:i/>
-          <w:color w:val="666666"/>
-          <w:sz w:val="17"/>
-        </w:rPr>
-        <w:t xml:space="preserve">  Si una pieza ya tiene precio mayor marcado, se respeta.</w:t>
-      </w:r>
     </w:p>
     <w:sectPr>
       <w:pgSz w:w="16838" w:h="11906" w:orient="landscape"/>

</xml_diff>